<commit_message>
chore(sih2026): update official team name to 'Trinetra AI Vision' (Team ID: 176248) across repo, docs, license, and reports
</commit_message>
<xml_diff>
--- a/docs/TRINETRA_SIH26106_Project_Report.docx
+++ b/docs/TRINETRA_SIH26106_Project_Report.docx
@@ -38,11 +38,13 @@
         <w:rPr>
           <w:i/>
           <w:color w:val="555555"/>
-          <w:sz w:val="22"/>
+          <w:sz w:val="21"/>
         </w:rPr>
         <w:t>Master Technical Project &amp; Prototype Architecture Report</w:t>
         <w:br/>
-        <w:t>Submitted by Team TrinetraAI | Section 63 BSA 2023 Compliant</w:t>
+        <w:t>Submitted by Team Trinetra AI Vision (Team ID: 176248)</w:t>
+        <w:br/>
+        <w:t>Sanaka Educational Trusts Group of Institutions (College Code: 278) | Section 63 BSA 2023 Compliant</w:t>
       </w:r>
     </w:p>
     <w:p>
@@ -56,7 +58,7 @@
         <w:spacing w:before="240" w:after="120"/>
       </w:pPr>
       <w:r>
-        <w:t>Team TrinetraAI — Roster &amp; Core Contributions</w:t>
+        <w:t>Team Trinetra AI Vision (Team ID: 176248) — Roster &amp; Core Contributions</w:t>
       </w:r>
     </w:p>
     <w:tbl>
@@ -655,7 +657,7 @@
     </w:p>
     <w:p>
       <w:r>
-        <w:t>Team TrinetraAI implemented an intensive 6-phase Agile/Scrum engineering lifecycle designed to achieve end-to-end technical readiness under the Smart India Hackathon standards:</w:t>
+        <w:t>Team Trinetra AI Vision implemented an intensive 6-phase Agile/Scrum engineering lifecycle designed to achieve end-to-end technical readiness under the Smart India Hackathon standards:</w:t>
         <w:br/>
         <w:t>• Phase 1 (Weeks 1–2): RFC Protocol &amp; Legal Foundations — Deep dive into RFC 5322, 7208 (SPF), 6376 (DKIM), 7489 (DMARC), and statutory conditions under Section 63 BSA 2023 and DPDP Act 2023.</w:t>
         <w:br/>

</xml_diff>